<commit_message>
Reweight analysis by occupation size (WLS + permutation test)
- Primary statistics now use employment-weighted regression (WLS)
- Added permutation test (10k permutations) for weighted Pearson r p-value
- Updated scatter plot to show WLS fit line with weighted stats
- Report rewritten with weighted results as primary, unweighted as reference

https://claude.ai/code/session_018qwwY2mDpPRyHHKd4Nmbu3
</commit_message>
<xml_diff>
--- a/AI_Exposure_Political_Affiliation_Analysis.docx
+++ b/AI_Exposure_Political_Affiliation_Analysis.docx
@@ -185,7 +185,7 @@
     </w:p>
     <w:p>
       <w:r>
-        <w:t>The analysis reveals a weak positive but statistically non-significant correlation between AI exposure and Democratic political leaning across the 47 matched occupations. The Pearson correlation coefficient is r = 0.174 (p = 0.243), well above the conventional p &lt; 0.05 threshold for statistical significance. The Spearman rank correlation is ρ = 0.157 (p = 0.292), also non-significant. When weighted by employment, the correlation increases slightly to r = 0.225, suggesting that larger occupations may exhibit a somewhat stronger pattern. However, with only 47 observations and substantial measurement uncertainty in the political data, these results should be interpreted cautiously. When restricted to the 8 high-confidence occupations only, the correlation drops to r = 0.100 (p = 0.814), essentially disappearing.</w:t>
+        <w:t>When weighted by employment size -- so that large occupations like retail salespersons (3.7M) and registered nurses (3.0M) carry proportionally more influence than smaller ones -- the employment-weighted Pearson correlation is r = 0.225 with a permutation-test p-value of 0.165 (10,000 permutations). The weighted least squares (WLS) regression slope is 0.197 (p = 0.128), with R² = 0.051. These results indicate a weak positive but statistically non-significant relationship between AI exposure and Democratic leaning, even after accounting for occupation size. For reference, the unweighted Pearson r = 0.174 (p = 0.243) and Spearman ρ = 0.157 (p = 0.292) are also non-significant. When restricted to the 8 high-confidence occupations only, the correlation drops to r ≈ 0.10 (p ≈ 0.81), essentially disappearing.</w:t>
       </w:r>
     </w:p>
     <w:p>
@@ -315,7 +315,117 @@
           </w:tcPr>
           <w:p>
             <w:r>
-              <w:t>Pearson r</w:t>
+              <w:t>Employment-weighted r</w:t>
+            </w:r>
+          </w:p>
+        </w:tc>
+        <w:tc>
+          <w:tcPr>
+            <w:tcW w:type="dxa" w:w="4320"/>
+          </w:tcPr>
+          <w:p>
+            <w:r>
+              <w:t>0.2250</w:t>
+            </w:r>
+          </w:p>
+        </w:tc>
+      </w:tr>
+      <w:tr>
+        <w:tc>
+          <w:tcPr>
+            <w:tcW w:type="dxa" w:w="4320"/>
+          </w:tcPr>
+          <w:p>
+            <w:r>
+              <w:t>Weighted r permutation p</w:t>
+            </w:r>
+          </w:p>
+        </w:tc>
+        <w:tc>
+          <w:tcPr>
+            <w:tcW w:type="dxa" w:w="4320"/>
+          </w:tcPr>
+          <w:p>
+            <w:r>
+              <w:t>0.1648</w:t>
+            </w:r>
+          </w:p>
+        </w:tc>
+      </w:tr>
+      <w:tr>
+        <w:tc>
+          <w:tcPr>
+            <w:tcW w:type="dxa" w:w="4320"/>
+          </w:tcPr>
+          <w:p>
+            <w:r>
+              <w:t>WLS slope</w:t>
+            </w:r>
+          </w:p>
+        </w:tc>
+        <w:tc>
+          <w:tcPr>
+            <w:tcW w:type="dxa" w:w="4320"/>
+          </w:tcPr>
+          <w:p>
+            <w:r>
+              <w:t>0.1965</w:t>
+            </w:r>
+          </w:p>
+        </w:tc>
+      </w:tr>
+      <w:tr>
+        <w:tc>
+          <w:tcPr>
+            <w:tcW w:type="dxa" w:w="4320"/>
+          </w:tcPr>
+          <w:p>
+            <w:r>
+              <w:t>WLS slope p-value</w:t>
+            </w:r>
+          </w:p>
+        </w:tc>
+        <w:tc>
+          <w:tcPr>
+            <w:tcW w:type="dxa" w:w="4320"/>
+          </w:tcPr>
+          <w:p>
+            <w:r>
+              <w:t>0.1283</w:t>
+            </w:r>
+          </w:p>
+        </w:tc>
+      </w:tr>
+      <w:tr>
+        <w:tc>
+          <w:tcPr>
+            <w:tcW w:type="dxa" w:w="4320"/>
+          </w:tcPr>
+          <w:p>
+            <w:r>
+              <w:t>WLS R²</w:t>
+            </w:r>
+          </w:p>
+        </w:tc>
+        <w:tc>
+          <w:tcPr>
+            <w:tcW w:type="dxa" w:w="4320"/>
+          </w:tcPr>
+          <w:p>
+            <w:r>
+              <w:t>0.0506</w:t>
+            </w:r>
+          </w:p>
+        </w:tc>
+      </w:tr>
+      <w:tr>
+        <w:tc>
+          <w:tcPr>
+            <w:tcW w:type="dxa" w:w="4320"/>
+          </w:tcPr>
+          <w:p>
+            <w:r>
+              <w:t>Unweighted Pearson r</w:t>
             </w:r>
           </w:p>
         </w:tc>
@@ -337,7 +447,7 @@
           </w:tcPr>
           <w:p>
             <w:r>
-              <w:t>p-value (two-tailed)</w:t>
+              <w:t>Unweighted p-value</w:t>
             </w:r>
           </w:p>
         </w:tc>
@@ -374,28 +484,6 @@
           </w:p>
         </w:tc>
       </w:tr>
-      <w:tr>
-        <w:tc>
-          <w:tcPr>
-            <w:tcW w:type="dxa" w:w="4320"/>
-          </w:tcPr>
-          <w:p>
-            <w:r>
-              <w:t>Employment-weighted r</w:t>
-            </w:r>
-          </w:p>
-        </w:tc>
-        <w:tc>
-          <w:tcPr>
-            <w:tcW w:type="dxa" w:w="4320"/>
-          </w:tcPr>
-          <w:p>
-            <w:r>
-              <w:t>0.2250</w:t>
-            </w:r>
-          </w:p>
-        </w:tc>
-      </w:tr>
     </w:tbl>
     <w:p/>
     <w:p>
@@ -408,7 +496,7 @@
     </w:p>
     <w:p>
       <w:r>
-        <w:t>The weak and non-significant correlation (r = 0.174, p = 0.243) suggests that, among the largest U.S. occupations, AI exposure does not strongly predict political affiliation. This null-ish result is itself informative: despite intuitions that AI might disproportionately affect workers of one political persuasion, the reality across major occupations is more heterogeneous.</w:t>
+        <w:t>Even after weighting by occupation size -- which gives greater influence to the millions of retail salespersons, nurses, and home health aides than to the hundreds of thousands of lawyers or police officers -- the correlation remains weak and non-significant (weighted r = 0.225, permutation p = 0.165; WLS slope p = 0.128). This suggests that, among the largest U.S. occupations, AI exposure does not strongly predict political affiliation regardless of how observations are weighted. This null-ish result is itself informative: despite intuitions that AI might disproportionately affect workers of one political persuasion, the reality across major occupations is more heterogeneous.</w:t>
       </w:r>
     </w:p>
     <w:p>
@@ -441,7 +529,7 @@
     </w:p>
     <w:p>
       <w:r>
-        <w:t>This exploratory analysis finds a weak positive but statistically non-significant correlation (r = 0.174, p = 0.243) between occupational AI exposure and Democratic political leaning across the 50 largest U.S. occupations. While there is a directional tendency for higher-AI-exposure occupations to lean somewhat more Democratic, the relationship is not strong enough to reach statistical significance, and it essentially vanishes (r = 0.10) when restricted to high-confidence data points. The scatter plot reveals substantial heterogeneity: occupations at similar AI exposure levels can lean in opposite political directions, suggesting that workforce demographics, occupational culture, unionization, and education level are far more powerful predictors of political affiliation than AI exposure. Future research should employ individual-level data from voter registration records (e.g., the Chinoy 2024 "VRscores" dataset) merged with O*NET task data, along with multivariate controls, to better isolate any relationship between AI exposure and political orientation.</w:t>
+        <w:t>This exploratory analysis finds a weak positive but statistically non-significant correlation between occupational AI exposure and Democratic political leaning across the 50 largest U.S. occupations. The employment-weighted correlation is r = 0.225 (permutation p = 0.165), and the WLS regression slope has p = 0.128. The unweighted Pearson r = 0.174 (p = 0.243) tells the same story. While there is a directional tendency for higher-AI-exposure occupations to lean somewhat more Democratic, the relationship is not strong enough to reach statistical significance at any conventional threshold, and it essentially vanishes (r ≈ 0.10) when restricted to high-confidence data points. The scatter plot reveals substantial heterogeneity: occupations at similar AI exposure levels can lean in opposite political directions, suggesting that workforce demographics, occupational culture, unionization, and education level are far more powerful predictors of political affiliation than AI exposure. Future research should employ individual-level data from voter registration records (e.g., the Chinoy 2024 "VRscores" dataset) merged with O*NET task data, along with multivariate controls, to better isolate any relationship between AI exposure and political orientation.</w:t>
       </w:r>
     </w:p>
     <w:p>

</xml_diff>